<commit_message>
fix: Leerzeilen-Absätze in Vorlagen + Obstbaum-Frist 31.03. bei Mitteilungen
Struktur-Tags ({% if erlaeuterung %} u. a.) standen als eigene Absätze
und blieben nach dem Rendern als Leerzeilen stehen -> ungleiche Abstände
um UPV-Erläuterung und Eskalationshinweis. Alle 12 Nur-Tag-Absätze in den
3 Vorlagen auf {%p %} umgestellt (Trägerabsatz wird entfernt); Plakette-/
Lob-Absätze auf einheitliches space_after. G07 (Obstbaumschnitt) in
Mitteilungen: Frist stets 31.03. (Winterschnitt, nächster Termin >= 14
Tage), Abmahnungen behalten 30.10. K35-Render visuell geprüft.

Co-Authored-By: Claude Fable 5 <noreply@anthropic.com>
</commit_message>
<xml_diff>
--- a/vorlagen/abmahnung_bv.docx
+++ b/vorlagen/abmahnung_bv.docx
@@ -235,7 +235,7 @@
           <w:b w:val="0"/>
           <w:i w:val="0"/>
         </w:rPr>
-        <w:t>{% if historie %}</w:t>
+        <w:t>{%p if historie %}</w:t>
       </w:r>
     </w:p>
     <w:p>
@@ -259,7 +259,7 @@
           <w:b w:val="0"/>
           <w:i w:val="0"/>
         </w:rPr>
-        <w:t>{% endif %}</w:t>
+        <w:t>{%p endif %}</w:t>
       </w:r>
     </w:p>
     <w:p>
@@ -390,7 +390,7 @@
           <w:b w:val="0"/>
           <w:i w:val="0"/>
         </w:rPr>
-        <w:t>{% if ersatzvornahme %}</w:t>
+        <w:t>{%p if ersatzvornahme %}</w:t>
       </w:r>
     </w:p>
     <w:p>
@@ -414,7 +414,7 @@
           <w:b w:val="0"/>
           <w:i w:val="0"/>
         </w:rPr>
-        <w:t>{% endif %}</w:t>
+        <w:t>{%p endif %}</w:t>
       </w:r>
     </w:p>
     <w:p>

</xml_diff>